<commit_message>
KAN-425: strengthen Psychiatry Research submission
</commit_message>
<xml_diff>
--- a/manuscript/submission/psychiatry-research/Cover_Letter_Psychiatry_Research_FINAL.docx
+++ b/manuscript/submission/psychiatry-research/Cover_Letter_Psychiatry_Research_FINAL.docx
@@ -67,15 +67,23 @@
         <w:pStyle w:val="Normal"/>
       </w:pPr>
       <w:r>
-        <w:t xml:space="preserve">The corrected P01 measure uses complete clock-aligned 10-minute blocks and exact temporal adjacency within a fixed 22:00–06:00 window. P01 was positively associated with PHQ-9 in the primary HC3 OLS models (Model 1: β=10.12663, 95% CI 7.35564–12.89762; Model 2: β=5.72278, 95% CI 2.47934–8.96622). Survey-weighted sensitivity analysis supported the direction of the association. In exploratory stratified five-fold cross-validation, adding P01 to demographic predictors increased out-of-fold AUC by 0.018 (95% CI 0.008–0.030), a modest increment.</w:t>
-      </w:r>
-    </w:p>
-    <w:p>
-      <w:pPr>
-        <w:pStyle w:val="Normal"/>
-      </w:pPr>
-      <w:r>
-        <w:t xml:space="preserve">The manuscript interprets these findings as cross-sectional associations; it makes no causal, diagnostic, or clinical-use claim. The analysis uses publicly available NHANES data, and the code and accepted outputs are available at https://github.com/0ArchLinux0/Nocturnal-Rest-Activity-Transition-Instability_NHANES-2013-2014.</w:t>
+        <w:t xml:space="preserve">I submit the work as a Full-Length Article because it evaluates a prespecified, reproducible temporal actigraphy feature through multiple inferential and robustness analyses, rather than reporting a brief descriptive secondary-data finding.</w:t>
+      </w:r>
+    </w:p>
+    <w:p>
+      <w:pPr>
+        <w:pStyle w:val="Normal"/>
+      </w:pPr>
+      <w:r>
+        <w:t xml:space="preserve">P01 uses complete clock-aligned 10-minute blocks and exact temporal adjacency within a fixed 22:00–06:00 window. P01 was positively associated with PHQ-9 in the primary HC3 OLS models (Model 1: β=10.12663, 95% CI 7.35564–12.89762; Model 2: β=5.72278, 95% CI 2.47934–8.96622). Survey-weighted sensitivity analysis supported the direction of the association. In exploratory stratified five-fold cross-validation, adding P01 to demographic predictors increased out-of-fold AUC by 0.018 (95% CI 0.008–0.030), a modest increment.</w:t>
+      </w:r>
+    </w:p>
+    <w:p>
+      <w:pPr>
+        <w:pStyle w:val="Normal"/>
+      </w:pPr>
+      <w:r>
+        <w:t xml:space="preserve">The manuscript interprets these findings as cross-sectional associations; it makes no causal, diagnostic, or clinical-use claim. The analysis uses publicly available NHANES data, and the code and study outputs are available at https://github.com/0ArchLinux0/Nocturnal-Rest-Activity-Transition-Instability_NHANES-2013-2014.</w:t>
       </w:r>
     </w:p>
     <w:p>

</xml_diff>

<commit_message>
KAN-424: finalize portal metadata before submission
</commit_message>
<xml_diff>
--- a/manuscript/submission/psychiatry-research/Cover_Letter_Psychiatry_Research_FINAL.docx
+++ b/manuscript/submission/psychiatry-research/Cover_Letter_Psychiatry_Research_FINAL.docx
@@ -67,7 +67,7 @@
         <w:pStyle w:val="Normal"/>
       </w:pPr>
       <w:r>
-        <w:t xml:space="preserve">I submit the work as a Full-Length Article because it evaluates a prespecified, reproducible temporal actigraphy feature through multiple inferential and robustness analyses, rather than reporting a brief descriptive secondary-data finding.</w:t>
+        <w:t xml:space="preserve">I submit the work as a Full-Length Article because it evaluates an explicitly defined, reproducible temporal actigraphy feature through multiple inferential and robustness analyses, rather than reporting a brief descriptive secondary-data finding.</w:t>
       </w:r>
     </w:p>
     <w:p>
@@ -123,15 +123,7 @@
         <w:pStyle w:val="Normal"/>
       </w:pPr>
       <w:r>
-        <w:t xml:space="preserve">Department of Medicine, Sapporo Medical University</w:t>
-      </w:r>
-    </w:p>
-    <w:p>
-      <w:pPr>
-        <w:pStyle w:val="Normal"/>
-      </w:pPr>
-      <w:r>
-        <w:t xml:space="preserve">Sapporo, Japan</w:t>
+        <w:t xml:space="preserve">School of Medicine, Sapporo Medical University, Sapporo, Japan</w:t>
       </w:r>
     </w:p>
     <w:p>

</xml_diff>